<commit_message>
pdf estudio inicial y plan de proyecto
</commit_message>
<xml_diff>
--- a/docs formales/Estudio_Inicial.docx
+++ b/docs formales/Estudio_Inicial.docx
@@ -40,12 +40,6 @@
         <w:gridCol w:w="3152"/>
       </w:tblGrid>
       <w:tr>
-        <w:tblPrEx>
-          <w:tblCellMar>
-            <w:top w:w="0" w:type="dxa"/>
-            <w:bottom w:w="0" w:type="dxa"/>
-          </w:tblCellMar>
-        </w:tblPrEx>
         <w:tc>
           <w:tcPr>
             <w:tcW w:w="9776" w:type="dxa"/>
@@ -76,6 +70,7 @@
             </w:pPr>
             <w:r>
               <w:rPr>
+                <w:noProof/>
                 <w:lang w:val="es-AR"/>
               </w:rPr>
               <w:lastRenderedPageBreak/>
@@ -157,6 +152,7 @@
             <w:r>
               <w:rPr>
                 <w:rFonts w:ascii="Arial" w:eastAsia="Arial" w:hAnsi="Arial" w:cs="Arial"/>
+                <w:noProof/>
                 <w:sz w:val="16"/>
                 <w:szCs w:val="16"/>
                 <w:lang w:val="es-AR"/>
@@ -299,12 +295,6 @@
         </w:tc>
       </w:tr>
       <w:tr>
-        <w:tblPrEx>
-          <w:tblCellMar>
-            <w:top w:w="0" w:type="dxa"/>
-            <w:bottom w:w="0" w:type="dxa"/>
-          </w:tblCellMar>
-        </w:tblPrEx>
         <w:tc>
           <w:tcPr>
             <w:tcW w:w="2513" w:type="dxa"/>
@@ -422,12 +412,6 @@
         </w:tc>
       </w:tr>
       <w:tr>
-        <w:tblPrEx>
-          <w:tblCellMar>
-            <w:top w:w="0" w:type="dxa"/>
-            <w:bottom w:w="0" w:type="dxa"/>
-          </w:tblCellMar>
-        </w:tblPrEx>
         <w:tc>
           <w:tcPr>
             <w:tcW w:w="2513" w:type="dxa"/>
@@ -528,12 +512,6 @@
         </w:tc>
       </w:tr>
       <w:tr>
-        <w:tblPrEx>
-          <w:tblCellMar>
-            <w:top w:w="0" w:type="dxa"/>
-            <w:bottom w:w="0" w:type="dxa"/>
-          </w:tblCellMar>
-        </w:tblPrEx>
         <w:tc>
           <w:tcPr>
             <w:tcW w:w="2513" w:type="dxa"/>
@@ -636,12 +614,6 @@
         </w:tc>
       </w:tr>
       <w:tr>
-        <w:tblPrEx>
-          <w:tblCellMar>
-            <w:top w:w="0" w:type="dxa"/>
-            <w:bottom w:w="0" w:type="dxa"/>
-          </w:tblCellMar>
-        </w:tblPrEx>
         <w:tc>
           <w:tcPr>
             <w:tcW w:w="2513" w:type="dxa"/>
@@ -743,12 +715,6 @@
         </w:tc>
       </w:tr>
       <w:tr>
-        <w:tblPrEx>
-          <w:tblCellMar>
-            <w:top w:w="0" w:type="dxa"/>
-            <w:bottom w:w="0" w:type="dxa"/>
-          </w:tblCellMar>
-        </w:tblPrEx>
         <w:tc>
           <w:tcPr>
             <w:tcW w:w="2513" w:type="dxa"/>
@@ -845,12 +811,6 @@
         </w:tc>
       </w:tr>
       <w:tr>
-        <w:tblPrEx>
-          <w:tblCellMar>
-            <w:top w:w="0" w:type="dxa"/>
-            <w:bottom w:w="0" w:type="dxa"/>
-          </w:tblCellMar>
-        </w:tblPrEx>
         <w:trPr>
           <w:trHeight w:val="40"/>
         </w:trPr>
@@ -1092,12 +1052,6 @@
         </w:tc>
       </w:tr>
       <w:tr>
-        <w:tblPrEx>
-          <w:tblCellMar>
-            <w:top w:w="0" w:type="dxa"/>
-            <w:bottom w:w="0" w:type="dxa"/>
-          </w:tblCellMar>
-        </w:tblPrEx>
         <w:trPr>
           <w:trHeight w:val="20"/>
         </w:trPr>
@@ -1247,12 +1201,6 @@
         </w:tc>
       </w:tr>
       <w:tr>
-        <w:tblPrEx>
-          <w:tblCellMar>
-            <w:top w:w="0" w:type="dxa"/>
-            <w:bottom w:w="0" w:type="dxa"/>
-          </w:tblCellMar>
-        </w:tblPrEx>
         <w:trPr>
           <w:trHeight w:val="20"/>
         </w:trPr>
@@ -1402,12 +1350,6 @@
         </w:tc>
       </w:tr>
       <w:tr>
-        <w:tblPrEx>
-          <w:tblCellMar>
-            <w:top w:w="0" w:type="dxa"/>
-            <w:bottom w:w="0" w:type="dxa"/>
-          </w:tblCellMar>
-        </w:tblPrEx>
         <w:trPr>
           <w:trHeight w:val="20"/>
         </w:trPr>
@@ -1557,12 +1499,6 @@
         </w:tc>
       </w:tr>
       <w:tr>
-        <w:tblPrEx>
-          <w:tblCellMar>
-            <w:top w:w="0" w:type="dxa"/>
-            <w:bottom w:w="0" w:type="dxa"/>
-          </w:tblCellMar>
-        </w:tblPrEx>
         <w:trPr>
           <w:trHeight w:val="20"/>
         </w:trPr>
@@ -1712,12 +1648,6 @@
         </w:tc>
       </w:tr>
       <w:tr>
-        <w:tblPrEx>
-          <w:tblCellMar>
-            <w:top w:w="0" w:type="dxa"/>
-            <w:bottom w:w="0" w:type="dxa"/>
-          </w:tblCellMar>
-        </w:tblPrEx>
         <w:trPr>
           <w:trHeight w:val="20"/>
         </w:trPr>
@@ -1877,12 +1807,6 @@
         </w:tc>
       </w:tr>
       <w:tr>
-        <w:tblPrEx>
-          <w:tblCellMar>
-            <w:top w:w="0" w:type="dxa"/>
-            <w:bottom w:w="0" w:type="dxa"/>
-          </w:tblCellMar>
-        </w:tblPrEx>
         <w:trPr>
           <w:trHeight w:val="20"/>
         </w:trPr>
@@ -2039,12 +1963,6 @@
         </w:tc>
       </w:tr>
       <w:tr>
-        <w:tblPrEx>
-          <w:tblCellMar>
-            <w:top w:w="0" w:type="dxa"/>
-            <w:bottom w:w="0" w:type="dxa"/>
-          </w:tblCellMar>
-        </w:tblPrEx>
         <w:trPr>
           <w:trHeight w:val="20"/>
         </w:trPr>
@@ -2197,12 +2115,6 @@
         </w:tc>
       </w:tr>
       <w:tr>
-        <w:tblPrEx>
-          <w:tblCellMar>
-            <w:top w:w="0" w:type="dxa"/>
-            <w:bottom w:w="0" w:type="dxa"/>
-          </w:tblCellMar>
-        </w:tblPrEx>
         <w:tc>
           <w:tcPr>
             <w:tcW w:w="2513" w:type="dxa"/>
@@ -2303,12 +2215,6 @@
         </w:tc>
       </w:tr>
       <w:tr>
-        <w:tblPrEx>
-          <w:tblCellMar>
-            <w:top w:w="0" w:type="dxa"/>
-            <w:bottom w:w="0" w:type="dxa"/>
-          </w:tblCellMar>
-        </w:tblPrEx>
         <w:tc>
           <w:tcPr>
             <w:tcW w:w="2513" w:type="dxa"/>
@@ -2425,12 +2331,6 @@
         </w:tc>
       </w:tr>
       <w:tr>
-        <w:tblPrEx>
-          <w:tblCellMar>
-            <w:top w:w="0" w:type="dxa"/>
-            <w:bottom w:w="0" w:type="dxa"/>
-          </w:tblCellMar>
-        </w:tblPrEx>
         <w:tc>
           <w:tcPr>
             <w:tcW w:w="2513" w:type="dxa"/>
@@ -2533,12 +2433,6 @@
         </w:tc>
       </w:tr>
       <w:tr>
-        <w:tblPrEx>
-          <w:tblCellMar>
-            <w:top w:w="0" w:type="dxa"/>
-            <w:bottom w:w="0" w:type="dxa"/>
-          </w:tblCellMar>
-        </w:tblPrEx>
         <w:tc>
           <w:tcPr>
             <w:tcW w:w="2513" w:type="dxa"/>
@@ -2712,6 +2606,14 @@
     </w:p>
     <w:sdt>
       <w:sdtPr>
+        <w:rPr>
+          <w:rFonts w:ascii="Calibri" w:eastAsiaTheme="minorEastAsia" w:hAnsi="Calibri" w:cstheme="minorBidi"/>
+          <w:b w:val="0"/>
+          <w:bCs w:val="0"/>
+          <w:color w:val="24292E"/>
+          <w:sz w:val="22"/>
+          <w:szCs w:val="22"/>
+        </w:rPr>
         <w:id w:val="613177384"/>
         <w:docPartObj>
           <w:docPartGallery w:val="Table of Contents"/>
@@ -2720,11 +2622,7 @@
       </w:sdtPr>
       <w:sdtEndPr>
         <w:rPr>
-          <w:rFonts w:ascii="Calibri" w:eastAsiaTheme="minorEastAsia" w:hAnsi="Calibri" w:cstheme="minorBidi"/>
           <w:noProof/>
-          <w:color w:val="24292E"/>
-          <w:sz w:val="22"/>
-          <w:szCs w:val="22"/>
         </w:rPr>
       </w:sdtEndPr>
       <w:sdtContent>
@@ -3666,21 +3564,7 @@
                 <w:rStyle w:val="Hipervnculo"/>
                 <w:noProof/>
               </w:rPr>
-              <w:t>3.5.2. Los Seis (6) Estados Oficiales del E</w:t>
-            </w:r>
-            <w:r>
-              <w:rPr>
-                <w:rStyle w:val="Hipervnculo"/>
-                <w:noProof/>
-              </w:rPr>
-              <w:t>x</w:t>
-            </w:r>
-            <w:r>
-              <w:rPr>
-                <w:rStyle w:val="Hipervnculo"/>
-                <w:noProof/>
-              </w:rPr>
-              <w:t>pediente (Art. 12 del Reglamento Procesal Disciplinario 2026</w:t>
+              <w:t>3.5.2. Los Seis (6) Estados Oficiales del Expediente (Art. 12 del Reglamento Procesal Disciplinario 2026</w:t>
             </w:r>
             <w:r>
               <w:rPr>
@@ -5280,7 +5164,39 @@
         <w:t>CD (Comisión Directiva)</w:t>
       </w:r>
       <w:r>
-        <w:t>: Órgano ejecutivo de gobierno de AVEIT compuesto por 7 miembros (Presidente, Vicepresidente, Tesorero, Protesorero, Secretario General, Prosecretario y Secretario de Actas), responsable de la administración cotidiana, coordinación de subcomisiones y conducción institucional.</w:t>
+        <w:t>: Órgano ejecutivo de gobierno de AVEIT compuesto por 7 miembros (</w:t>
+      </w:r>
+      <w:proofErr w:type="gramStart"/>
+      <w:r>
+        <w:t>Presidente</w:t>
+      </w:r>
+      <w:proofErr w:type="gramEnd"/>
+      <w:r>
+        <w:t xml:space="preserve">, </w:t>
+      </w:r>
+      <w:proofErr w:type="gramStart"/>
+      <w:r>
+        <w:t>Vicepresidente</w:t>
+      </w:r>
+      <w:proofErr w:type="gramEnd"/>
+      <w:r>
+        <w:t xml:space="preserve">, Tesorero, Protesorero, </w:t>
+      </w:r>
+      <w:proofErr w:type="gramStart"/>
+      <w:r>
+        <w:t>Secretario General</w:t>
+      </w:r>
+      <w:proofErr w:type="gramEnd"/>
+      <w:r>
+        <w:t xml:space="preserve">, Prosecretario y </w:t>
+      </w:r>
+      <w:proofErr w:type="gramStart"/>
+      <w:r>
+        <w:t>Secretario</w:t>
+      </w:r>
+      <w:proofErr w:type="gramEnd"/>
+      <w:r>
+        <w:t xml:space="preserve"> de Actas), responsable de la administración cotidiana, coordinación de subcomisiones y conducción institucional.</w:t>
       </w:r>
     </w:p>
     <w:p>
@@ -5430,7 +5346,23 @@
         <w:t>Formulario T01 / Anexo T01</w:t>
       </w:r>
       <w:r>
-        <w:t>: Instrumento administrativo estandarizado mediante el cual una Autoridad, Presidente de Subcomisión o Jefe de Equipo solicita formalmente ante el TD la apertura de un expediente de premiación o sanción, detallando las causas circunstanciadas en su hoja de Anexo.</w:t>
+        <w:t xml:space="preserve">: Instrumento administrativo estandarizado mediante el cual una Autoridad, </w:t>
+      </w:r>
+      <w:proofErr w:type="gramStart"/>
+      <w:r>
+        <w:t>Presidente</w:t>
+      </w:r>
+      <w:proofErr w:type="gramEnd"/>
+      <w:r>
+        <w:t xml:space="preserve"> de Subcomisión o </w:t>
+      </w:r>
+      <w:proofErr w:type="gramStart"/>
+      <w:r>
+        <w:t>Jefe</w:t>
+      </w:r>
+      <w:proofErr w:type="gramEnd"/>
+      <w:r>
+        <w:t xml:space="preserve"> de Equipo solicita formalmente ante el TD la apertura de un expediente de premiación o sanción, detallando las causas circunstanciadas en su hoja de Anexo.</w:t>
       </w:r>
     </w:p>
     <w:p>
@@ -5826,6 +5758,9 @@
         <w:jc w:val="center"/>
       </w:pPr>
       <w:r>
+        <w:rPr>
+          <w:noProof/>
+        </w:rPr>
         <w:drawing>
           <wp:inline distT="0" distB="0" distL="0" distR="0" wp14:anchorId="3FD4743A" wp14:editId="547BA910">
             <wp:extent cx="5029200" cy="2696716"/>
@@ -6002,7 +5937,39 @@
         <w:spacing w:before="20" w:after="40"/>
       </w:pPr>
       <w:r>
-        <w:t>Comisión Directiva: 7 miembros (Presidente, Vicepresidente, Tesorero, Protesorero, Secretario General, Prosecretario y Secretario de Actas).</w:t>
+        <w:t>Comisión Directiva: 7 miembros (</w:t>
+      </w:r>
+      <w:proofErr w:type="gramStart"/>
+      <w:r>
+        <w:t>Presidente</w:t>
+      </w:r>
+      <w:proofErr w:type="gramEnd"/>
+      <w:r>
+        <w:t xml:space="preserve">, </w:t>
+      </w:r>
+      <w:proofErr w:type="gramStart"/>
+      <w:r>
+        <w:t>Vicepresidente</w:t>
+      </w:r>
+      <w:proofErr w:type="gramEnd"/>
+      <w:r>
+        <w:t xml:space="preserve">, Tesorero, Protesorero, </w:t>
+      </w:r>
+      <w:proofErr w:type="gramStart"/>
+      <w:r>
+        <w:t>Secretario General</w:t>
+      </w:r>
+      <w:proofErr w:type="gramEnd"/>
+      <w:r>
+        <w:t xml:space="preserve">, Prosecretario y </w:t>
+      </w:r>
+      <w:proofErr w:type="gramStart"/>
+      <w:r>
+        <w:t>Secretario</w:t>
+      </w:r>
+      <w:proofErr w:type="gramEnd"/>
+      <w:r>
+        <w:t xml:space="preserve"> de Actas).</w:t>
       </w:r>
     </w:p>
     <w:p>
@@ -6251,7 +6218,15 @@
         <w:spacing w:before="20" w:after="40"/>
       </w:pPr>
       <w:r>
-        <w:t>Tribunal de Disciplina: Puede actuar de oficio cuando ninguna otra autoridad haya accionado, o solicitar expedientes en concepto de “rectificación”. El miembro del TD que solicite una medida no puede participar del juzgamiento de la misma.</w:t>
+        <w:t xml:space="preserve">Tribunal de Disciplina: Puede actuar de oficio cuando ninguna otra autoridad haya accionado, o solicitar expedientes en concepto de “rectificación”. El miembro del TD que solicite una medida no puede participar del juzgamiento de </w:t>
+      </w:r>
+      <w:proofErr w:type="gramStart"/>
+      <w:r>
+        <w:t>la misma</w:t>
+      </w:r>
+      <w:proofErr w:type="gramEnd"/>
+      <w:r>
+        <w:t>.</w:t>
       </w:r>
     </w:p>
     <w:p>
@@ -6260,7 +6235,15 @@
         <w:spacing w:before="20" w:after="40"/>
       </w:pPr>
       <w:r>
-        <w:t>Presidentes y Vicepresidentes de Subcomisión: Pueden accionar exclusivamente sobre los socios a su cargo (miembros ordinarios o voluntarios), no sobre las demás autoridades de la subcomisión.</w:t>
+        <w:t xml:space="preserve">Presidentes y </w:t>
+      </w:r>
+      <w:proofErr w:type="gramStart"/>
+      <w:r>
+        <w:t>Vicepresidentes</w:t>
+      </w:r>
+      <w:proofErr w:type="gramEnd"/>
+      <w:r>
+        <w:t xml:space="preserve"> de Subcomisión: Tienen alcance para solicitar sanciones o premiaciones sobre cualquier socio del padrón general, respondiendo a la dinámica operativa real de la Asociación donde coordinan actividades, guardias y eventos que involucran a socios de distintas subcomisiones o años sociales.</w:t>
       </w:r>
     </w:p>
     <w:p>
@@ -6362,7 +6345,15 @@
         <w:ind w:left="720"/>
       </w:pPr>
       <w:r>
-        <w:t>Omisión / Incumplimiento de Tareas Asignadas por CD o Autoridades Delegadas: Graduada desde un llamado de atención hasta dos (2) puntos negativos (-2).</w:t>
+        <w:t xml:space="preserve">Omisión / Incumplimiento de Tareas Asignadas por CD o Autoridades </w:t>
+      </w:r>
+      <w:proofErr w:type="gramStart"/>
+      <w:r>
+        <w:t>Delegadas</w:t>
+      </w:r>
+      <w:proofErr w:type="gramEnd"/>
+      <w:r>
+        <w:t>: Graduada desde un llamado de atención hasta dos (2) puntos negativos (-2).</w:t>
       </w:r>
     </w:p>
     <w:p>
@@ -7536,7 +7527,21 @@
               <w:rPr>
                 <w:sz w:val="19"/>
               </w:rPr>
-              <w:t>Cuentas institucionales de correo electrónico, plataformas de videoconferencia (Google Meet / Zoom / Discord) y carpetas compartidas en Google Workspace (Drive, Docs).</w:t>
+              <w:t xml:space="preserve">Cuentas institucionales de correo electrónico, plataformas de videoconferencia (Google Meet / </w:t>
+            </w:r>
+            <w:proofErr w:type="gramStart"/>
+            <w:r>
+              <w:rPr>
+                <w:sz w:val="19"/>
+              </w:rPr>
+              <w:t>Zoom</w:t>
+            </w:r>
+            <w:proofErr w:type="gramEnd"/>
+            <w:r>
+              <w:rPr>
+                <w:sz w:val="19"/>
+              </w:rPr>
+              <w:t xml:space="preserve"> / Discord) y carpetas compartidas en Google Workspace (Drive, Docs).</w:t>
             </w:r>
           </w:p>
         </w:tc>
@@ -9100,7 +9105,6 @@
   <w:style w:type="character" w:default="1" w:styleId="Fuentedeprrafopredeter">
     <w:name w:val="Default Paragraph Font"/>
     <w:uiPriority w:val="1"/>
-    <w:semiHidden/>
     <w:unhideWhenUsed/>
   </w:style>
   <w:style w:type="table" w:default="1" w:styleId="Tablanormal">
@@ -19891,7 +19895,6 @@
       <w:kern w:val="3"/>
       <w:sz w:val="24"/>
       <w:szCs w:val="24"/>
-      <w:lang/>
     </w:rPr>
   </w:style>
   <w:style w:type="character" w:customStyle="1" w:styleId="Internetlink">

</xml_diff>